<commit_message>
Reconstruir el PPTX ejecutivo con el enfoque del sistema de 90 días
El PPTX (19 diapositivas, paleta carbón + bronce) ahora sigue el mismo
marco del documento de 90 días: embudo completo (Atención→...→Cierre)
con el alcance de la gestión marcado, 10 perfiles de comprador, 7 tesis
de adquisición, estrategia de Meta Ads sin depender solo de intereses,
sistema de calificación, remarketing progresivo, plan mes a mes,
cronograma de 12 semanas, KPIs de calidad sobre volumen, alcance de la
gestión vs. propietario, limitaciones, honorarios e información
requerida.

En ambos documentos, la landing page se presenta ahora como un activo
digital propio (no una plantilla genérica) con un valor adicional de
$450.000 de pago único, independiente de los honorarios mensuales de
gestión y del presupuesto de pauta.

Co-Authored-By: Claude Sonnet 5 <noreply@anthropic.com>
Claude-Session: https://claude.ai/code/session_01SmkHKcxHsRiRKSPUZSC2qb
</commit_message>
<xml_diff>
--- a/Hosty56 - Plan de Venta (Edificio Airbnb Bogota)/Plan_90_Dias_Sistema_Adquisicion.docx
+++ b/Hosty56 - Plan de Venta (Edificio Airbnb Bogota)/Plan_90_Dias_Sistema_Adquisicion.docx
@@ -3557,6 +3557,37 @@
           <w:szCs w:val="21"/>
         </w:rPr>
         <w:t xml:space="preserve">Disclaimer: los datos financieros son aproximados y están sujetos a validación y documentación formal</w:t>
+      </w:r>
+    </w:p>
+    <w:p>
+      <w:pPr>
+        <w:pStyle w:val="Heading2"/>
+        <w:spacing w:after="140" w:before="280"/>
+      </w:pPr>
+      <w:r>
+        <w:rPr>
+          <w:rFonts w:ascii="Calibri" w:cs="Calibri" w:eastAsia="Calibri" w:hAnsi="Calibri"/>
+          <w:b/>
+          <w:bCs/>
+          <w:color w:val="B08D57"/>
+          <w:sz w:val="23"/>
+          <w:szCs w:val="23"/>
+        </w:rPr>
+        <w:t xml:space="preserve">Naturaleza e inversión de este entregable</w:t>
+      </w:r>
+    </w:p>
+    <w:p>
+      <w:pPr>
+        <w:spacing w:after="140"/>
+      </w:pPr>
+      <w:r>
+        <w:rPr>
+          <w:rFonts w:ascii="Calibri" w:cs="Calibri" w:eastAsia="Calibri" w:hAnsi="Calibri"/>
+          <w:color w:val="222222"/>
+          <w:sz w:val="21"/>
+          <w:szCs w:val="21"/>
+        </w:rPr>
+        <w:t xml:space="preserve">Esta landing page no es una plantilla genérica de campaña: es un activo digital propio del proyecto, con diseño, redacción y lógica de calificación construidos específicamente para este activo de $4.000 millones. Por su diseño, desarrollo y configuración de calificación, tiene un valor adicional de $450.000 (pago único), independiente de los honorarios mensuales de gestión y del presupuesto de pauta en Meta Ads.</w:t>
       </w:r>
     </w:p>
     <w:p>

</xml_diff>